<commit_message>
update ai page and schedule
</commit_message>
<xml_diff>
--- a/_site/syllabus.docx
+++ b/_site/syllabus.docx
@@ -46,7 +46,7 @@
       </w:r>
     </w:p>
     <w:bookmarkEnd w:id="20"/>
-    <w:bookmarkStart w:id="27" w:name="course-information"/>
+    <w:bookmarkStart w:id="28" w:name="course-information"/>
     <w:p>
       <w:pPr>
         <w:pStyle w:val="Heading2"/>
@@ -128,11 +128,11 @@
         </w:numPr>
       </w:pPr>
       <w:r>
-        <w:t xml:space="preserve">TTBD</w:t>
+        <w:t xml:space="preserve">TBD</w:t>
       </w:r>
     </w:p>
     <w:bookmarkEnd w:id="23"/>
-    <w:bookmarkStart w:id="24" w:name="ta"/>
+    <w:bookmarkStart w:id="25" w:name="ta"/>
     <w:p>
       <w:pPr>
         <w:pStyle w:val="Heading3"/>
@@ -167,7 +167,7 @@
       <w:r>
         <w:t xml:space="preserve"> </w:t>
       </w:r>
-      <w:hyperlink r:id="rId22">
+      <w:hyperlink r:id="rId24">
         <w:r>
           <w:rPr>
             <w:rStyle w:val="Hyperlink"/>
@@ -188,7 +188,7 @@
         <w:t xml:space="preserve"> </w:t>
       </w:r>
       <w:r>
-        <w:t xml:space="preserve">TBD</w:t>
+        <w:t xml:space="preserve">217 Riley-Robb Hall</w:t>
       </w:r>
     </w:p>
     <w:p>
@@ -200,11 +200,11 @@
         </w:numPr>
       </w:pPr>
       <w:r>
-        <w:t xml:space="preserve">TBD</w:t>
-      </w:r>
-    </w:p>
-    <w:bookmarkEnd w:id="24"/>
-    <w:bookmarkStart w:id="25" w:name="meetings"/>
+        <w:t xml:space="preserve">MW 4:15-5:15</w:t>
+      </w:r>
+    </w:p>
+    <w:bookmarkEnd w:id="25"/>
+    <w:bookmarkStart w:id="26" w:name="meetings"/>
     <w:p>
       <w:pPr>
         <w:pStyle w:val="Heading3"/>
@@ -258,8 +258,8 @@
         <w:t xml:space="preserve">105 Riley-Robb</w:t>
       </w:r>
     </w:p>
-    <w:bookmarkEnd w:id="25"/>
-    <w:bookmarkStart w:id="26" w:name="course-description"/>
+    <w:bookmarkEnd w:id="26"/>
+    <w:bookmarkStart w:id="27" w:name="course-description"/>
     <w:p>
       <w:pPr>
         <w:pStyle w:val="Heading3"/>
@@ -348,9 +348,9 @@
         <w:t xml:space="preserve">explore trade-offs across competing objectives.</w:t>
       </w:r>
     </w:p>
-    <w:bookmarkEnd w:id="26"/>
     <w:bookmarkEnd w:id="27"/>
-    <w:bookmarkStart w:id="28" w:name="learning-outcomes"/>
+    <w:bookmarkEnd w:id="28"/>
+    <w:bookmarkStart w:id="29" w:name="learning-outcomes"/>
     <w:p>
       <w:pPr>
         <w:pStyle w:val="Heading2"/>
@@ -439,8 +439,8 @@
         <w:t xml:space="preserve">Evaluate modeled outcomes with respect to model assumptions and limits.</w:t>
       </w:r>
     </w:p>
-    <w:bookmarkEnd w:id="28"/>
-    <w:bookmarkStart w:id="32" w:name="prerequisites-preparation"/>
+    <w:bookmarkEnd w:id="29"/>
+    <w:bookmarkStart w:id="33" w:name="prerequisites-preparation"/>
     <w:p>
       <w:pPr>
         <w:pStyle w:val="Heading2"/>
@@ -564,18 +564,18 @@
                 <wp:inline>
                   <wp:extent cx="152400" cy="152400"/>
                   <wp:effectExtent b="0" l="0" r="0" t="0"/>
-                  <wp:docPr descr="" title="" id="30" name="Picture"/>
+                  <wp:docPr descr="" title="" id="31" name="Picture"/>
                   <a:graphic>
                     <a:graphicData uri="http://schemas.openxmlformats.org/drawingml/2006/picture">
                       <pic:pic>
                         <pic:nvPicPr>
-                          <pic:cNvPr descr="/Applications/quarto/share/formats/docx/tip.png" id="31" name="Picture"/>
+                          <pic:cNvPr descr="/Applications/quarto/share/formats/docx/tip.png" id="32" name="Picture"/>
                           <pic:cNvPicPr>
                             <a:picLocks noChangeArrowheads="1" noChangeAspect="1"/>
                           </pic:cNvPicPr>
                         </pic:nvPicPr>
                         <pic:blipFill>
-                          <a:blip r:embed="rId29"/>
+                          <a:blip r:embed="rId30"/>
                           <a:stretch>
                             <a:fillRect/>
                           </a:stretch>
@@ -638,8 +638,8 @@
         </w:tc>
       </w:tr>
     </w:tbl>
-    <w:bookmarkEnd w:id="32"/>
-    <w:bookmarkStart w:id="33" w:name="topics"/>
+    <w:bookmarkEnd w:id="33"/>
+    <w:bookmarkStart w:id="34" w:name="topics"/>
     <w:p>
       <w:pPr>
         <w:pStyle w:val="Heading2"/>
@@ -856,8 +856,8 @@
         <w:t xml:space="preserve">Reservoir management</w:t>
       </w:r>
     </w:p>
-    <w:bookmarkEnd w:id="33"/>
-    <w:bookmarkStart w:id="34" w:name="course-philosophy-and-expectations"/>
+    <w:bookmarkEnd w:id="34"/>
+    <w:bookmarkStart w:id="35" w:name="course-philosophy-and-expectations"/>
     <w:p>
       <w:pPr>
         <w:pStyle w:val="Heading2"/>
@@ -1022,8 +1022,8 @@
         <w:t xml:space="preserve">and attending office hours as needed.</w:t>
       </w:r>
     </w:p>
-    <w:bookmarkEnd w:id="34"/>
-    <w:bookmarkStart w:id="49" w:name="community"/>
+    <w:bookmarkEnd w:id="35"/>
+    <w:bookmarkStart w:id="50" w:name="community"/>
     <w:p>
       <w:pPr>
         <w:pStyle w:val="Heading2"/>
@@ -1032,7 +1032,7 @@
         <w:t xml:space="preserve">Community</w:t>
       </w:r>
     </w:p>
-    <w:bookmarkStart w:id="38" w:name="diversity-and-inclusion"/>
+    <w:bookmarkStart w:id="39" w:name="diversity-and-inclusion"/>
     <w:p>
       <w:pPr>
         <w:pStyle w:val="Heading3"/>
@@ -1167,18 +1167,18 @@
                 <wp:inline>
                   <wp:extent cx="152400" cy="152400"/>
                   <wp:effectExtent b="0" l="0" r="0" t="0"/>
-                  <wp:docPr descr="" title="" id="36" name="Picture"/>
+                  <wp:docPr descr="" title="" id="37" name="Picture"/>
                   <a:graphic>
                     <a:graphicData uri="http://schemas.openxmlformats.org/drawingml/2006/picture">
                       <pic:pic>
                         <pic:nvPicPr>
-                          <pic:cNvPr descr="/Applications/quarto/share/formats/docx/important.png" id="37" name="Picture"/>
+                          <pic:cNvPr descr="/Applications/quarto/share/formats/docx/important.png" id="38" name="Picture"/>
                           <pic:cNvPicPr>
                             <a:picLocks noChangeArrowheads="1" noChangeAspect="1"/>
                           </pic:cNvPicPr>
                         </pic:nvPicPr>
                         <pic:blipFill>
-                          <a:blip r:embed="rId35"/>
+                          <a:blip r:embed="rId36"/>
                           <a:stretch>
                             <a:fillRect/>
                           </a:stretch>
@@ -1241,8 +1241,8 @@
         </w:tc>
       </w:tr>
     </w:tbl>
-    <w:bookmarkEnd w:id="38"/>
-    <w:bookmarkStart w:id="40" w:name="student-accomodations"/>
+    <w:bookmarkEnd w:id="39"/>
+    <w:bookmarkStart w:id="41" w:name="student-accomodations"/>
     <w:p>
       <w:pPr>
         <w:pStyle w:val="Heading3"/>
@@ -1261,7 +1261,7 @@
       <w:r>
         <w:t xml:space="preserve"> </w:t>
       </w:r>
-      <w:hyperlink r:id="rId39">
+      <w:hyperlink r:id="rId40">
         <w:r>
           <w:rPr>
             <w:rStyle w:val="Hyperlink"/>
@@ -1284,8 +1284,8 @@
         <w:t xml:space="preserve">If you need more immediate accomodations, but do not yet have a letter, please let me know and then follow up with SDS.</w:t>
       </w:r>
     </w:p>
-    <w:bookmarkEnd w:id="40"/>
-    <w:bookmarkStart w:id="44" w:name="course-communications"/>
+    <w:bookmarkEnd w:id="41"/>
+    <w:bookmarkStart w:id="45" w:name="course-communications"/>
     <w:p>
       <w:pPr>
         <w:pStyle w:val="Heading3"/>
@@ -1304,7 +1304,7 @@
       <w:r>
         <w:t xml:space="preserve"> </w:t>
       </w:r>
-      <w:hyperlink r:id="rId41">
+      <w:hyperlink r:id="rId42">
         <w:r>
           <w:rPr>
             <w:rStyle w:val="Hyperlink"/>
@@ -1366,18 +1366,18 @@
                 <wp:inline>
                   <wp:extent cx="152400" cy="152400"/>
                   <wp:effectExtent b="0" l="0" r="0" t="0"/>
-                  <wp:docPr descr="" title="" id="42" name="Picture"/>
+                  <wp:docPr descr="" title="" id="43" name="Picture"/>
                   <a:graphic>
                     <a:graphicData uri="http://schemas.openxmlformats.org/drawingml/2006/picture">
                       <pic:pic>
                         <pic:nvPicPr>
-                          <pic:cNvPr descr="/Applications/quarto/share/formats/docx/important.png" id="43" name="Picture"/>
+                          <pic:cNvPr descr="/Applications/quarto/share/formats/docx/important.png" id="44" name="Picture"/>
                           <pic:cNvPicPr>
                             <a:picLocks noChangeArrowheads="1" noChangeAspect="1"/>
                           </pic:cNvPicPr>
                         </pic:nvPicPr>
                         <pic:blipFill>
-                          <a:blip r:embed="rId35"/>
+                          <a:blip r:embed="rId36"/>
                           <a:stretch>
                             <a:fillRect/>
                           </a:stretch>
@@ -1485,8 +1485,8 @@
         </w:tc>
       </w:tr>
     </w:tbl>
-    <w:bookmarkEnd w:id="44"/>
-    <w:bookmarkStart w:id="48" w:name="mental-health-resources"/>
+    <w:bookmarkEnd w:id="45"/>
+    <w:bookmarkStart w:id="49" w:name="mental-health-resources"/>
     <w:p>
       <w:pPr>
         <w:pStyle w:val="Heading3"/>
@@ -1505,7 +1505,7 @@
       <w:r>
         <w:t xml:space="preserve"> </w:t>
       </w:r>
-      <w:hyperlink r:id="rId45">
+      <w:hyperlink r:id="rId46">
         <w:r>
           <w:rPr>
             <w:rStyle w:val="Hyperlink"/>
@@ -1559,18 +1559,18 @@
                 <wp:inline>
                   <wp:extent cx="152400" cy="152400"/>
                   <wp:effectExtent b="0" l="0" r="0" t="0"/>
-                  <wp:docPr descr="" title="" id="46" name="Picture"/>
+                  <wp:docPr descr="" title="" id="47" name="Picture"/>
                   <a:graphic>
                     <a:graphicData uri="http://schemas.openxmlformats.org/drawingml/2006/picture">
                       <pic:pic>
                         <pic:nvPicPr>
-                          <pic:cNvPr descr="/Applications/quarto/share/formats/docx/important.png" id="47" name="Picture"/>
+                          <pic:cNvPr descr="/Applications/quarto/share/formats/docx/important.png" id="48" name="Picture"/>
                           <pic:cNvPicPr>
                             <a:picLocks noChangeArrowheads="1" noChangeAspect="1"/>
                           </pic:cNvPicPr>
                         </pic:nvPicPr>
                         <pic:blipFill>
-                          <a:blip r:embed="rId35"/>
+                          <a:blip r:embed="rId36"/>
                           <a:stretch>
                             <a:fillRect/>
                           </a:stretch>
@@ -1633,9 +1633,9 @@
         </w:tc>
       </w:tr>
     </w:tbl>
-    <w:bookmarkEnd w:id="48"/>
     <w:bookmarkEnd w:id="49"/>
-    <w:bookmarkStart w:id="73" w:name="course-policies"/>
+    <w:bookmarkEnd w:id="50"/>
+    <w:bookmarkStart w:id="74" w:name="course-policies"/>
     <w:p>
       <w:pPr>
         <w:pStyle w:val="Heading2"/>
@@ -1652,7 +1652,7 @@
         <w:t xml:space="preserve">Many policies below (including grading policies) are broken out and discussed further on the course website. Lack of familiarity with any of these policies is not an excuse for violating any of them.</w:t>
       </w:r>
     </w:p>
-    <w:bookmarkStart w:id="52" w:name="attendance"/>
+    <w:bookmarkStart w:id="53" w:name="attendance"/>
     <w:p>
       <w:pPr>
         <w:pStyle w:val="Heading3"/>
@@ -1724,18 +1724,18 @@
                 <wp:inline>
                   <wp:extent cx="152400" cy="152400"/>
                   <wp:effectExtent b="0" l="0" r="0" t="0"/>
-                  <wp:docPr descr="" title="" id="50" name="Picture"/>
+                  <wp:docPr descr="" title="" id="51" name="Picture"/>
                   <a:graphic>
                     <a:graphicData uri="http://schemas.openxmlformats.org/drawingml/2006/picture">
                       <pic:pic>
                         <pic:nvPicPr>
-                          <pic:cNvPr descr="/Applications/quarto/share/formats/docx/important.png" id="51" name="Picture"/>
+                          <pic:cNvPr descr="/Applications/quarto/share/formats/docx/important.png" id="52" name="Picture"/>
                           <pic:cNvPicPr>
                             <a:picLocks noChangeArrowheads="1" noChangeAspect="1"/>
                           </pic:cNvPicPr>
                         </pic:nvPicPr>
                         <pic:blipFill>
-                          <a:blip r:embed="rId35"/>
+                          <a:blip r:embed="rId36"/>
                           <a:stretch>
                             <a:fillRect/>
                           </a:stretch>
@@ -1798,8 +1798,8 @@
         </w:tc>
       </w:tr>
     </w:tbl>
-    <w:bookmarkEnd w:id="52"/>
-    <w:bookmarkStart w:id="53" w:name="mask-policies"/>
+    <w:bookmarkEnd w:id="53"/>
+    <w:bookmarkStart w:id="54" w:name="mask-policies"/>
     <w:p>
       <w:pPr>
         <w:pStyle w:val="Heading3"/>
@@ -1816,8 +1816,8 @@
         <w:t xml:space="preserve">Please stay home and rest if you have symptoms of COVID-19 or any other respiratory illness. No masking will be required, but please be respectful of others who may wear masks or take other precautions to avoid illness. This policy may change if there is another outbreak of COVID-19 (or other illness), but will be kept consistent with broader Cornell mask policies.</w:t>
       </w:r>
     </w:p>
-    <w:bookmarkEnd w:id="53"/>
-    <w:bookmarkStart w:id="58" w:name="academic-integrity"/>
+    <w:bookmarkEnd w:id="54"/>
+    <w:bookmarkStart w:id="59" w:name="academic-integrity"/>
     <w:p>
       <w:pPr>
         <w:pStyle w:val="Heading3"/>
@@ -1868,18 +1868,18 @@
                 <wp:inline>
                   <wp:extent cx="152400" cy="152400"/>
                   <wp:effectExtent b="0" l="0" r="0" t="0"/>
-                  <wp:docPr descr="" title="" id="54" name="Picture"/>
+                  <wp:docPr descr="" title="" id="55" name="Picture"/>
                   <a:graphic>
                     <a:graphicData uri="http://schemas.openxmlformats.org/drawingml/2006/picture">
                       <pic:pic>
                         <pic:nvPicPr>
-                          <pic:cNvPr descr="/Applications/quarto/share/formats/docx/important.png" id="55" name="Picture"/>
+                          <pic:cNvPr descr="/Applications/quarto/share/formats/docx/important.png" id="56" name="Picture"/>
                           <pic:cNvPicPr>
                             <a:picLocks noChangeArrowheads="1" noChangeAspect="1"/>
                           </pic:cNvPicPr>
                         </pic:nvPicPr>
                         <pic:blipFill>
-                          <a:blip r:embed="rId35"/>
+                          <a:blip r:embed="rId36"/>
                           <a:stretch>
                             <a:fillRect/>
                           </a:stretch>
@@ -1959,7 +1959,7 @@
       <w:r>
         <w:t xml:space="preserve"> </w:t>
       </w:r>
-      <w:hyperlink r:id="rId56">
+      <w:hyperlink r:id="rId57">
         <w:r>
           <w:rPr>
             <w:rStyle w:val="Hyperlink"/>
@@ -2005,7 +2005,7 @@
       <w:r>
         <w:t xml:space="preserve"> </w:t>
       </w:r>
-      <w:hyperlink r:id="rId57">
+      <w:hyperlink r:id="rId58">
         <w:r>
           <w:rPr>
             <w:rStyle w:val="Hyperlink"/>
@@ -2017,8 +2017,8 @@
         <w:t xml:space="preserve">).</w:t>
       </w:r>
     </w:p>
-    <w:bookmarkEnd w:id="58"/>
-    <w:bookmarkStart w:id="59" w:name="external-resources"/>
+    <w:bookmarkEnd w:id="59"/>
+    <w:bookmarkStart w:id="60" w:name="external-resources"/>
     <w:p>
       <w:pPr>
         <w:pStyle w:val="Heading3"/>
@@ -2064,8 +2064,8 @@
         <w:t xml:space="preserve">external resources which are consulted while working on an assignment should be referenced, including other students and faculty with whom the assignment is discussed. You will never be penalized for consulting an external source for help and referencing it, but plagiarism will result in a zero for that assignment as well as the potential for your case to be passed on for additional disciplinary action.</w:t>
       </w:r>
     </w:p>
-    <w:bookmarkEnd w:id="59"/>
-    <w:bookmarkStart w:id="60" w:name="aiml-resource-policy"/>
+    <w:bookmarkEnd w:id="60"/>
+    <w:bookmarkStart w:id="61" w:name="aiml-resource-policy"/>
     <w:p>
       <w:pPr>
         <w:pStyle w:val="Heading3"/>
@@ -2231,8 +2231,8 @@
         <w:t xml:space="preserve">If you have any questions about whether your planned use of an AI/ML tool complies with the academic integrity policy, please consult a member of the course staff ahead of its use.</w:t>
       </w:r>
     </w:p>
-    <w:bookmarkEnd w:id="60"/>
-    <w:bookmarkStart w:id="61" w:name="late-work-policy"/>
+    <w:bookmarkEnd w:id="61"/>
+    <w:bookmarkStart w:id="62" w:name="late-work-policy"/>
     <w:p>
       <w:pPr>
         <w:pStyle w:val="Heading3"/>
@@ -2265,8 +2265,8 @@
         <w:t xml:space="preserve">(ideally before the due date) if legitimate circumstances emerge which prevent you from submitting work within 24 hours of the due date; we will make accomodations for approved reasons, which might included a limited extension or dropping the assignment.</w:t>
       </w:r>
     </w:p>
-    <w:bookmarkEnd w:id="61"/>
-    <w:bookmarkStart w:id="69" w:name="regrade-requests"/>
+    <w:bookmarkEnd w:id="62"/>
+    <w:bookmarkStart w:id="70" w:name="regrade-requests"/>
     <w:p>
       <w:pPr>
         <w:pStyle w:val="Heading3"/>
@@ -2488,18 +2488,18 @@
                 <wp:inline>
                   <wp:extent cx="152400" cy="152400"/>
                   <wp:effectExtent b="0" l="0" r="0" t="0"/>
-                  <wp:docPr descr="" title="" id="62" name="Picture"/>
+                  <wp:docPr descr="" title="" id="63" name="Picture"/>
                   <a:graphic>
                     <a:graphicData uri="http://schemas.openxmlformats.org/drawingml/2006/picture">
                       <pic:pic>
                         <pic:nvPicPr>
-                          <pic:cNvPr descr="/Applications/quarto/share/formats/docx/important.png" id="63" name="Picture"/>
+                          <pic:cNvPr descr="/Applications/quarto/share/formats/docx/important.png" id="64" name="Picture"/>
                           <pic:cNvPicPr>
                             <a:picLocks noChangeArrowheads="1" noChangeAspect="1"/>
                           </pic:cNvPicPr>
                         </pic:nvPicPr>
                         <pic:blipFill>
-                          <a:blip r:embed="rId35"/>
+                          <a:blip r:embed="rId36"/>
                           <a:stretch>
                             <a:fillRect/>
                           </a:stretch>
@@ -2612,18 +2612,18 @@
                 <wp:inline>
                   <wp:extent cx="152400" cy="152400"/>
                   <wp:effectExtent b="0" l="0" r="0" t="0"/>
-                  <wp:docPr descr="" title="" id="65" name="Picture"/>
+                  <wp:docPr descr="" title="" id="66" name="Picture"/>
                   <a:graphic>
                     <a:graphicData uri="http://schemas.openxmlformats.org/drawingml/2006/picture">
                       <pic:pic>
                         <pic:nvPicPr>
-                          <pic:cNvPr descr="/Applications/quarto/share/formats/docx/warning.png" id="66" name="Picture"/>
+                          <pic:cNvPr descr="/Applications/quarto/share/formats/docx/warning.png" id="67" name="Picture"/>
                           <pic:cNvPicPr>
                             <a:picLocks noChangeArrowheads="1" noChangeAspect="1"/>
                           </pic:cNvPicPr>
                         </pic:nvPicPr>
                         <pic:blipFill>
-                          <a:blip r:embed="rId64"/>
+                          <a:blip r:embed="rId65"/>
                           <a:stretch>
                             <a:fillRect/>
                           </a:stretch>
@@ -2736,18 +2736,18 @@
                 <wp:inline>
                   <wp:extent cx="152400" cy="152400"/>
                   <wp:effectExtent b="0" l="0" r="0" t="0"/>
-                  <wp:docPr descr="" title="" id="67" name="Picture"/>
+                  <wp:docPr descr="" title="" id="68" name="Picture"/>
                   <a:graphic>
                     <a:graphicData uri="http://schemas.openxmlformats.org/drawingml/2006/picture">
                       <pic:pic>
                         <pic:nvPicPr>
-                          <pic:cNvPr descr="/Applications/quarto/share/formats/docx/tip.png" id="68" name="Picture"/>
+                          <pic:cNvPr descr="/Applications/quarto/share/formats/docx/tip.png" id="69" name="Picture"/>
                           <pic:cNvPicPr>
                             <a:picLocks noChangeArrowheads="1" noChangeAspect="1"/>
                           </pic:cNvPicPr>
                         </pic:nvPicPr>
                         <pic:blipFill>
-                          <a:blip r:embed="rId29"/>
+                          <a:blip r:embed="rId30"/>
                           <a:stretch>
                             <a:fillRect/>
                           </a:stretch>
@@ -2864,8 +2864,8 @@
         </w:tc>
       </w:tr>
     </w:tbl>
-    <w:bookmarkEnd w:id="69"/>
-    <w:bookmarkStart w:id="72" w:name="office-hours"/>
+    <w:bookmarkEnd w:id="70"/>
+    <w:bookmarkStart w:id="73" w:name="office-hours"/>
     <w:p>
       <w:pPr>
         <w:pStyle w:val="Heading3"/>
@@ -2963,18 +2963,18 @@
                 <wp:inline>
                   <wp:extent cx="152400" cy="152400"/>
                   <wp:effectExtent b="0" l="0" r="0" t="0"/>
-                  <wp:docPr descr="" title="" id="70" name="Picture"/>
+                  <wp:docPr descr="" title="" id="71" name="Picture"/>
                   <a:graphic>
                     <a:graphicData uri="http://schemas.openxmlformats.org/drawingml/2006/picture">
                       <pic:pic>
                         <pic:nvPicPr>
-                          <pic:cNvPr descr="/Applications/quarto/share/formats/docx/tip.png" id="71" name="Picture"/>
+                          <pic:cNvPr descr="/Applications/quarto/share/formats/docx/tip.png" id="72" name="Picture"/>
                           <pic:cNvPicPr>
                             <a:picLocks noChangeArrowheads="1" noChangeAspect="1"/>
                           </pic:cNvPicPr>
                         </pic:nvPicPr>
                         <pic:blipFill>
-                          <a:blip r:embed="rId29"/>
+                          <a:blip r:embed="rId30"/>
                           <a:stretch>
                             <a:fillRect/>
                           </a:stretch>
@@ -3086,9 +3086,9 @@
         </w:tc>
       </w:tr>
     </w:tbl>
-    <w:bookmarkEnd w:id="72"/>
     <w:bookmarkEnd w:id="73"/>
-    <w:bookmarkStart w:id="84" w:name="assessments"/>
+    <w:bookmarkEnd w:id="74"/>
+    <w:bookmarkStart w:id="85" w:name="assessments"/>
     <w:p>
       <w:pPr>
         <w:pStyle w:val="Heading2"/>
@@ -3377,18 +3377,18 @@
                 <wp:inline>
                   <wp:extent cx="152400" cy="152400"/>
                   <wp:effectExtent b="0" l="0" r="0" t="0"/>
-                  <wp:docPr descr="" title="" id="75" name="Picture"/>
+                  <wp:docPr descr="" title="" id="76" name="Picture"/>
                   <a:graphic>
                     <a:graphicData uri="http://schemas.openxmlformats.org/drawingml/2006/picture">
                       <pic:pic>
                         <pic:nvPicPr>
-                          <pic:cNvPr descr="/Applications/quarto/share/formats/docx/note.png" id="76" name="Picture"/>
+                          <pic:cNvPr descr="/Applications/quarto/share/formats/docx/note.png" id="77" name="Picture"/>
                           <pic:cNvPicPr>
                             <a:picLocks noChangeArrowheads="1" noChangeAspect="1"/>
                           </pic:cNvPicPr>
                         </pic:nvPicPr>
                         <pic:blipFill>
-                          <a:blip r:embed="rId74"/>
+                          <a:blip r:embed="rId75"/>
                           <a:stretch>
                             <a:fillRect/>
                           </a:stretch>
@@ -3467,7 +3467,7 @@
         </w:tc>
       </w:tr>
     </w:tbl>
-    <w:bookmarkStart w:id="77" w:name="participation"/>
+    <w:bookmarkStart w:id="78" w:name="participation"/>
     <w:p>
       <w:pPr>
         <w:pStyle w:val="Heading3"/>
@@ -3540,8 +3540,8 @@
         <w:t xml:space="preserve">Note that just passively attending class will not yield full participation points. Participation points are not free: you are likely to lose points if you consistently skip class or do not ask or answer questions online or in person. At the end of the term, you will be asked to evaluate your own participation over the course of the semester, in addition to my documentation of your participation.</w:t>
       </w:r>
     </w:p>
-    <w:bookmarkEnd w:id="77"/>
-    <w:bookmarkStart w:id="78" w:name="reading-assignments"/>
+    <w:bookmarkEnd w:id="78"/>
+    <w:bookmarkStart w:id="79" w:name="reading-assignments"/>
     <w:p>
       <w:pPr>
         <w:pStyle w:val="Heading3"/>
@@ -3598,8 +3598,8 @@
         <w:t xml:space="preserve">While discussions are not required for students enrolled in 4750, doing the readings and posting your thoughts on Ed Discussion is a good way to improve your participation grade.</w:t>
       </w:r>
     </w:p>
-    <w:bookmarkEnd w:id="78"/>
-    <w:bookmarkStart w:id="79" w:name="exercises"/>
+    <w:bookmarkEnd w:id="79"/>
+    <w:bookmarkStart w:id="80" w:name="exercises"/>
     <w:p>
       <w:pPr>
         <w:pStyle w:val="Heading3"/>
@@ -3616,8 +3616,8 @@
         <w:t xml:space="preserve">Most weeks will involve a short problem set aimed at assessing key concepts. We will use Canvas for these exercises. These will be released Monday at the start of class and are due before class (2:55PM) the following Monday. The exercises will be multiple choice or similar (categorization, multiple answer, etc), automatically graded, and you can submit them as often as you like. It is highly recommended that you do these promptly and take them seriously, as concepts and simple code practice will be useful for the homeworks and midterm exams. We will automatically drop one exercise set, but no late exercises will be accepted.</w:t>
       </w:r>
     </w:p>
-    <w:bookmarkEnd w:id="79"/>
-    <w:bookmarkStart w:id="80" w:name="labs"/>
+    <w:bookmarkEnd w:id="80"/>
+    <w:bookmarkStart w:id="81" w:name="labs"/>
     <w:p>
       <w:pPr>
         <w:pStyle w:val="Heading3"/>
@@ -3634,8 +3634,8 @@
         <w:t xml:space="preserve">Approximately 4 class periods will be dedicated to working through simple examples to guide you through applying concepts and methods from class. Students should bring their laptops to class, and will be given a worksheet to complete (as much as they can) during these lab classes. Labs will be designed to be completed in class, though you may occasionally require additional time; however, lab worksheets must be submitted by 9:00pm on the day after the lab day. As a result, I encourage you to make sure that you download and set up the lab materials ahead of time; these will be provided for you on Ed Discussion. Labs will be graded on a scale of 0-3 on the basis of effort towards demonstrated work, rather than absolute correctness or completion. No labs will be dropped by default. If you cannot bring a laptop to class, you can work with other students, though you must turn in your own worksheet for grading.</w:t>
       </w:r>
     </w:p>
-    <w:bookmarkEnd w:id="80"/>
-    <w:bookmarkStart w:id="81" w:name="homework-assignments"/>
+    <w:bookmarkEnd w:id="81"/>
+    <w:bookmarkStart w:id="82" w:name="homework-assignments"/>
     <w:p>
       <w:pPr>
         <w:pStyle w:val="Heading3"/>
@@ -3782,8 +3782,8 @@
         <w:t xml:space="preserve">*! We cannot grade you on the basis of information which was not included in the submitted assignment. While regrade requests should include a justification for why your grade is incorrect, we will not consider explanations or additional reasoning outside of the submission.</w:t>
       </w:r>
     </w:p>
-    <w:bookmarkEnd w:id="81"/>
-    <w:bookmarkStart w:id="82" w:name="prelims"/>
+    <w:bookmarkEnd w:id="82"/>
+    <w:bookmarkStart w:id="83" w:name="prelims"/>
     <w:p>
       <w:pPr>
         <w:pStyle w:val="Heading3"/>
@@ -3837,8 +3837,8 @@
         <w:t xml:space="preserve">Solutions will not be posted for the midterms, but Prof. Srikrishnan will review and discuss midterm problems in class. The review will occur approximately two weeks after the exam to provide time for conflict exams and grading.</w:t>
       </w:r>
     </w:p>
-    <w:bookmarkEnd w:id="82"/>
-    <w:bookmarkStart w:id="83" w:name="final-term-project"/>
+    <w:bookmarkEnd w:id="83"/>
+    <w:bookmarkStart w:id="84" w:name="final-term-project"/>
     <w:p>
       <w:pPr>
         <w:pStyle w:val="Heading3"/>
@@ -4093,9 +4093,9 @@
         <w:t xml:space="preserve">.</w:t>
       </w:r>
     </w:p>
-    <w:bookmarkEnd w:id="83"/>
     <w:bookmarkEnd w:id="84"/>
-    <w:bookmarkStart w:id="90" w:name="grading"/>
+    <w:bookmarkEnd w:id="85"/>
+    <w:bookmarkStart w:id="91" w:name="grading"/>
     <w:p>
       <w:pPr>
         <w:pStyle w:val="Heading2"/>
@@ -4104,7 +4104,7 @@
         <w:t xml:space="preserve">Grading</w:t>
       </w:r>
     </w:p>
-    <w:bookmarkStart w:id="87" w:name="grading-scale"/>
+    <w:bookmarkStart w:id="88" w:name="grading-scale"/>
     <w:p>
       <w:pPr>
         <w:pStyle w:val="Heading3"/>
@@ -4523,18 +4523,18 @@
                 <wp:inline>
                   <wp:extent cx="152400" cy="152400"/>
                   <wp:effectExtent b="0" l="0" r="0" t="0"/>
-                  <wp:docPr descr="" title="" id="85" name="Picture"/>
+                  <wp:docPr descr="" title="" id="86" name="Picture"/>
                   <a:graphic>
                     <a:graphicData uri="http://schemas.openxmlformats.org/drawingml/2006/picture">
                       <pic:pic>
                         <pic:nvPicPr>
-                          <pic:cNvPr descr="/Applications/quarto/share/formats/docx/note.png" id="86" name="Picture"/>
+                          <pic:cNvPr descr="/Applications/quarto/share/formats/docx/note.png" id="87" name="Picture"/>
                           <pic:cNvPicPr>
                             <a:picLocks noChangeArrowheads="1" noChangeAspect="1"/>
                           </pic:cNvPicPr>
                         </pic:nvPicPr>
                         <pic:blipFill>
-                          <a:blip r:embed="rId74"/>
+                          <a:blip r:embed="rId75"/>
                           <a:stretch>
                             <a:fillRect/>
                           </a:stretch>
@@ -4640,8 +4640,8 @@
         </w:tc>
       </w:tr>
     </w:tbl>
-    <w:bookmarkEnd w:id="87"/>
-    <w:bookmarkStart w:id="88" w:name="forgiven-assignments"/>
+    <w:bookmarkEnd w:id="88"/>
+    <w:bookmarkStart w:id="89" w:name="forgiven-assignments"/>
     <w:p>
       <w:pPr>
         <w:pStyle w:val="Heading3"/>
@@ -4689,8 +4689,8 @@
         <w:t xml:space="preserve">submitted homeworks will carry more weight in the overall grade computation. In exceptional cases, we will compute course grades based entirely on exams.</w:t>
       </w:r>
     </w:p>
-    <w:bookmarkEnd w:id="88"/>
-    <w:bookmarkStart w:id="89" w:name="exceptions"/>
+    <w:bookmarkEnd w:id="89"/>
+    <w:bookmarkStart w:id="90" w:name="exceptions"/>
     <w:p>
       <w:pPr>
         <w:pStyle w:val="Heading3"/>
@@ -4751,8 +4751,8 @@
         <w:t xml:space="preserve">This should not generally be a concern; students putting in a good faith effort by attending class, participating in online discussions, doing most of the work, and taking the exams will not be at risk of this policy.</w:t>
       </w:r>
     </w:p>
-    <w:bookmarkEnd w:id="89"/>
     <w:bookmarkEnd w:id="90"/>
+    <w:bookmarkEnd w:id="91"/>
     <w:sectPr>
       <w:footnotePr>
         <w:numRestart w:val="eachSect"/>

</xml_diff>